<commit_message>
feat: implement hard delete functionality for students and enhance error handling in API responses
</commit_message>
<xml_diff>
--- a/doc-students/student-guide.docx
+++ b/doc-students/student-guide.docx
@@ -1354,16 +1354,6 @@
     <w:p>
       <w:pPr>
         <w:spacing w:after="0" w:line="240" w:lineRule="auto"/>
-        <w:rPr>
-          <w:rFonts w:ascii="TH Sarabun New" w:hAnsi="TH Sarabun New" w:cs="TH Sarabun New"/>
-          <w:sz w:val="32"/>
-          <w:szCs w:val="32"/>
-        </w:rPr>
-      </w:pPr>
-    </w:p>
-    <w:p>
-      <w:pPr>
-        <w:spacing w:after="0" w:line="240" w:lineRule="auto"/>
         <w:ind w:firstLine="426"/>
         <w:rPr>
           <w:rFonts w:ascii="TH Sarabun New" w:hAnsi="TH Sarabun New" w:cs="TH Sarabun New"/>
@@ -1737,10 +1727,97 @@
         <w:spacing w:after="0" w:line="240" w:lineRule="auto"/>
         <w:rPr>
           <w:rFonts w:ascii="TH Sarabun New" w:hAnsi="TH Sarabun New" w:cs="TH Sarabun New"/>
-          <w:sz w:val="32"/>
-          <w:szCs w:val="32"/>
+          <w:b/>
+          <w:bCs/>
+          <w:color w:val="4F46E5"/>
+          <w:sz w:val="52"/>
+          <w:szCs w:val="52"/>
+          <w:lang w:bidi="th-TH"/>
+        </w:rPr>
+      </w:pPr>
+      <w:r>
+        <w:rPr>
+          <w:rFonts w:ascii="TH Sarabun New" w:hAnsi="TH Sarabun New" w:cs="TH Sarabun New"/>
+          <w:b/>
+          <w:color w:val="4F46E5"/>
+          <w:sz w:val="52"/>
+          <w:szCs w:val="32"/>
+        </w:rPr>
+        <w:t>2</w:t>
+      </w:r>
+      <w:r>
+        <w:rPr>
+          <w:rFonts w:ascii="TH Sarabun New" w:hAnsi="TH Sarabun New" w:cs="TH Sarabun New"/>
+          <w:b/>
+          <w:bCs/>
+          <w:color w:val="4F46E5"/>
+          <w:sz w:val="52"/>
+          <w:szCs w:val="52"/>
           <w:cs/>
           <w:lang w:bidi="th-TH"/>
+        </w:rPr>
+        <w:t xml:space="preserve">. </w:t>
+      </w:r>
+      <w:r>
+        <w:rPr>
+          <w:rFonts w:ascii="TH Sarabun New" w:hAnsi="TH Sarabun New" w:cs="TH Sarabun New"/>
+          <w:b/>
+          <w:bCs/>
+          <w:color w:val="4F46E5"/>
+          <w:sz w:val="52"/>
+          <w:szCs w:val="52"/>
+          <w:lang w:bidi="th-TH"/>
+        </w:rPr>
+        <w:t xml:space="preserve">Username </w:t>
+      </w:r>
+      <w:r>
+        <w:rPr>
+          <w:rFonts w:ascii="TH Sarabun New" w:hAnsi="TH Sarabun New" w:cs="TH Sarabun New"/>
+          <w:b/>
+          <w:bCs/>
+          <w:color w:val="4F46E5"/>
+          <w:sz w:val="52"/>
+          <w:szCs w:val="52"/>
+          <w:cs/>
+          <w:lang w:bidi="th-TH"/>
+        </w:rPr>
+        <w:t xml:space="preserve">และ </w:t>
+      </w:r>
+      <w:r>
+        <w:rPr>
+          <w:rFonts w:ascii="TH Sarabun New" w:hAnsi="TH Sarabun New" w:cs="TH Sarabun New"/>
+          <w:b/>
+          <w:bCs/>
+          <w:color w:val="4F46E5"/>
+          <w:sz w:val="52"/>
+          <w:szCs w:val="52"/>
+          <w:lang w:bidi="th-TH"/>
+        </w:rPr>
+        <w:t xml:space="preserve">Password </w:t>
+      </w:r>
+      <w:r>
+        <w:rPr>
+          <w:rFonts w:ascii="TH Sarabun New" w:hAnsi="TH Sarabun New" w:cs="TH Sarabun New"/>
+          <w:b/>
+          <w:bCs/>
+          <w:color w:val="4F46E5"/>
+          <w:sz w:val="52"/>
+          <w:szCs w:val="52"/>
+          <w:cs/>
+          <w:lang w:bidi="th-TH"/>
+        </w:rPr>
+        <w:t>สำหรับ ทดสอบระบบ</w:t>
+      </w:r>
+    </w:p>
+    <w:p>
+      <w:pPr>
+        <w:spacing w:after="0" w:line="240" w:lineRule="auto"/>
+        <w:rPr>
+          <w:rFonts w:ascii="TH Sarabun New" w:hAnsi="TH Sarabun New" w:cs="TH Sarabun New"/>
+          <w:sz w:val="32"/>
+          <w:szCs w:val="32"/>
+          <w:rtl/>
+          <w:cs/>
         </w:rPr>
       </w:pPr>
     </w:p>
@@ -1751,6 +1828,8 @@
           <w:rFonts w:ascii="TH Sarabun New" w:hAnsi="TH Sarabun New" w:cs="TH Sarabun New"/>
           <w:sz w:val="32"/>
           <w:szCs w:val="32"/>
+          <w:cs/>
+          <w:lang w:bidi="th-TH"/>
         </w:rPr>
       </w:pPr>
     </w:p>
@@ -1771,8 +1850,6 @@
           <w:rFonts w:ascii="TH Sarabun New" w:hAnsi="TH Sarabun New" w:cs="TH Sarabun New"/>
           <w:sz w:val="32"/>
           <w:szCs w:val="32"/>
-          <w:cs/>
-          <w:lang w:bidi="th-TH"/>
         </w:rPr>
       </w:pPr>
     </w:p>
@@ -1783,6 +1860,8 @@
           <w:rFonts w:ascii="TH Sarabun New" w:hAnsi="TH Sarabun New" w:cs="TH Sarabun New"/>
           <w:sz w:val="32"/>
           <w:szCs w:val="32"/>
+          <w:cs/>
+          <w:lang w:bidi="th-TH"/>
         </w:rPr>
       </w:pPr>
     </w:p>
@@ -1815,6 +1894,26 @@
           <w:szCs w:val="32"/>
         </w:rPr>
       </w:pPr>
+    </w:p>
+    <w:p>
+      <w:pPr>
+        <w:spacing w:after="0" w:line="240" w:lineRule="auto"/>
+        <w:rPr>
+          <w:rFonts w:ascii="TH Sarabun New" w:hAnsi="TH Sarabun New" w:cs="TH Sarabun New"/>
+          <w:sz w:val="32"/>
+          <w:szCs w:val="32"/>
+        </w:rPr>
+      </w:pPr>
+    </w:p>
+    <w:p>
+      <w:pPr>
+        <w:spacing w:after="0" w:line="240" w:lineRule="auto"/>
+        <w:rPr>
+          <w:rFonts w:ascii="TH Sarabun New" w:hAnsi="TH Sarabun New" w:cs="TH Sarabun New"/>
+          <w:sz w:val="32"/>
+          <w:szCs w:val="32"/>
+        </w:rPr>
+      </w:pPr>
       <w:r>
         <w:rPr>
           <w:rFonts w:ascii="TH Sarabun New" w:hAnsi="TH Sarabun New" w:cs="TH Sarabun New"/>
@@ -1823,7 +1922,6 @@
           <w:sz w:val="52"/>
           <w:szCs w:val="32"/>
         </w:rPr>
-        <w:lastRenderedPageBreak/>
         <w:t>3</w:t>
       </w:r>
       <w:r>
@@ -2596,6 +2694,7 @@
           <w:cs/>
           <w:lang w:bidi="th-TH"/>
         </w:rPr>
+        <w:lastRenderedPageBreak/>
         <w:t xml:space="preserve">เมื่อกรอกครบ </w:t>
       </w:r>
       <w:r>
@@ -2707,7 +2806,6 @@
           <w:sz w:val="52"/>
           <w:szCs w:val="32"/>
         </w:rPr>
-        <w:lastRenderedPageBreak/>
         <w:t>4</w:t>
       </w:r>
       <w:r>
@@ -3310,7 +3408,6 @@
           <w:sz w:val="52"/>
           <w:szCs w:val="32"/>
         </w:rPr>
-        <w:lastRenderedPageBreak/>
         <w:t>5</w:t>
       </w:r>
       <w:r>
@@ -4037,7 +4134,6 @@
           <w:cs/>
           <w:lang w:bidi="th-TH"/>
         </w:rPr>
-        <w:lastRenderedPageBreak/>
         <w:t>คำแนะนำในการตอบ</w:t>
       </w:r>
     </w:p>
@@ -4943,7 +5039,6 @@
           <w:sz w:val="52"/>
           <w:szCs w:val="32"/>
         </w:rPr>
-        <w:lastRenderedPageBreak/>
         <w:t>6</w:t>
       </w:r>
       <w:r>
@@ -5820,7 +5915,6 @@
           <w:sz w:val="44"/>
           <w:szCs w:val="32"/>
         </w:rPr>
-        <w:lastRenderedPageBreak/>
         <w:t xml:space="preserve">CDI </w:t>
       </w:r>
       <w:r>
@@ -6299,7 +6393,6 @@
           <w:sz w:val="44"/>
           <w:szCs w:val="32"/>
         </w:rPr>
-        <w:lastRenderedPageBreak/>
         <w:t>PHQ</w:t>
       </w:r>
       <w:r>
@@ -20772,7 +20865,7 @@
 </file>
 
 <file path=customXml/itemProps1.xml><?xml version="1.0" encoding="utf-8"?>
-<ds:datastoreItem xmlns:ds="http://schemas.openxmlformats.org/officeDocument/2006/customXml" ds:itemID="{A1F943DF-FE55-4FB7-B47A-A6677D28CAD4}">
+<ds:datastoreItem xmlns:ds="http://schemas.openxmlformats.org/officeDocument/2006/customXml" ds:itemID="{8F3BC151-F934-4DC4-B456-1C755A0CB471}">
   <ds:schemaRefs>
     <ds:schemaRef ds:uri="http://schemas.openxmlformats.org/officeDocument/2006/bibliography"/>
   </ds:schemaRefs>

</xml_diff>